<commit_message>
Organize hardware resources, shared docs, and Python SDK
Add a Star Arm 102-style hardware layout and the supplied V3.1 assembly
STEP, preserving its bytes and marking unavailable resources as pending.
Create synchronized English and Chinese resource pages and a shared root
docs entry for assembly, calibration, and operation guides.

Move the teleoperation program and installer into python-sdk without
changing their implementation. Keep the Word guide under root docs and
update repository URLs, working directories, and README links.
Treat STEP exports as binary assets to preserve their original contents.

Validation: local links in 12 Markdown files and structure of 6 bilingual
README pairs pass; translations reviewed manually. Python syntax/help,
installer shell syntax, explicit README anchors, and staged whitespace
checks pass. Staged STEP matches the supplied file byte-for-byte. Word
guide rendered and visually reviewed. CAD import and hardware operation
have not been validated.
</commit_message>
<xml_diff>
--- a/docs/StarArm102_Lumos_Python_Teleoperation_Guide.docx
+++ b/docs/StarArm102_Lumos_Python_Teleoperation_Guide.docx
@@ -513,7 +513,7 @@
           <w:color w:val="203B50"/>
           <w:sz w:val="17"/>
         </w:rPr>
-        <w:t>git clone https://github.com/VincentHSS/stararm102-lumos-teleop.git</w:t>
+        <w:t>git clone https://github.com/servodevelop/touch-leader-arm.git</w:t>
       </w:r>
       <w:r>
         <w:br/>
@@ -524,7 +524,7 @@
           <w:color w:val="203B50"/>
           <w:sz w:val="17"/>
         </w:rPr>
-        <w:t>cd stararm102-lumos-teleop</w:t>
+        <w:t>cd touch-leader-arm/python-sdk</w:t>
       </w:r>
       <w:r>
         <w:br/>
@@ -548,7 +548,7 @@
           <w:color w:val="263746"/>
           <w:sz w:val="19"/>
         </w:rPr>
-        <w:t>请先激活 Python 3.10 环境。安装脚本会安装 C++ 构建依赖和 StarArm Python 包，并自动将 Lumos SDK 下载到项目的 .dependencies/startouch_sdk 目录后完成安装。整个过程需要联网和 sudo 权限；不需要手动进入 SDK 源码目录。</w:t>
+        <w:t>请先激活 Python 3.10 环境。安装脚本会安装 C++ 构建依赖和 StarArm Python 包，并自动将 Lumos SDK 下载到python-sdk/.dependencies/startouch_sdk 目录后完成安装。整个过程需要联网和 sudo 权限；不需要手动进入 SDK 源码目录。</w:t>
       </w:r>
     </w:p>
     <w:p>
@@ -606,7 +606,7 @@
           <w:color w:val="263746"/>
           <w:sz w:val="19"/>
         </w:rPr>
-        <w:t>如果需要逐步安装，请在已激活的 Python 3.10 环境和项目根目录执行以下命令。SDK 会下载到 .dependencies/startouch_sdk，无需手动切换到 SDK 源码目录。</w:t>
+        <w:t>如果需要逐步安装，请在已激活的 Python 3.10 环境和python-sdk/ 目录执行以下命令。SDK 会下载到 .dependencies/startouch_sdk，无需手动切换到 SDK 源码目录。</w:t>
       </w:r>
     </w:p>
     <w:p>
@@ -766,7 +766,7 @@
           <w:color w:val="263746"/>
           <w:sz w:val="19"/>
         </w:rPr>
-        <w:t>安装脚本已将程序放在项目根目录。确认 can0 状态：</w:t>
+        <w:t>遥操作脚本位于 python-sdk/ 目录。后续命令均在此目录执行。确认 can0 状态：</w:t>
       </w:r>
     </w:p>
     <w:p>
@@ -1346,7 +1346,7 @@
           <w:color w:val="203B50"/>
           <w:sz w:val="17"/>
         </w:rPr>
-        <w:t>python ~/stararm102_lumos_teleop.py --calibrate --can can0 --leader-port /dev/ttyUSB0 --gripper</w:t>
+        <w:t>python stararm102_lumos_teleop.py --calibrate --can can0 --leader-port /dev/ttyUSB0 --gripper</w:t>
       </w:r>
     </w:p>
     <w:p>
@@ -1477,7 +1477,7 @@
           <w:color w:val="203B50"/>
           <w:sz w:val="17"/>
         </w:rPr>
-        <w:t>python ~/stararm102_lumos_teleop.py --can can0 --leader-port /dev/ttyUSB0 --gripper</w:t>
+        <w:t>python stararm102_lumos_teleop.py --can can0 --leader-port /dev/ttyUSB0 --gripper</w:t>
       </w:r>
     </w:p>
     <w:p>
@@ -1522,7 +1522,7 @@
           <w:color w:val="203B50"/>
           <w:sz w:val="17"/>
         </w:rPr>
-        <w:t>python ~/stararm102_lumos_teleop.py --can can0 --leader-port /dev/ttyUSB0 --gripper --execute</w:t>
+        <w:t>python stararm102_lumos_teleop.py --can can0 --leader-port /dev/ttyUSB0 --gripper --execute</w:t>
       </w:r>
     </w:p>
     <w:p>
@@ -1689,7 +1689,7 @@
                 <w:color w:val="263746"/>
                 <w:sz w:val="17"/>
               </w:rPr>
-              <w:t>激活安装时使用的 Python 3.10 环境，在项目根目录运行 bash scripts/install_ubuntu.sh。</w:t>
+              <w:t>激活安装时使用的 Python 3.10 环境，在python-sdk/ 目录运行 bash scripts/install_ubuntu.sh。</w:t>
             </w:r>
           </w:p>
         </w:tc>

</xml_diff>